<commit_message>
Simplify lab submission and update student details
</commit_message>
<xml_diff>
--- a/AI_Lab_Explanation.docx
+++ b/AI_Lab_Explanation.docx
@@ -11,9 +11,7 @@
           <w:b/>
           <w:sz w:val="36"/>
         </w:rPr>
-        <w:t>CAI601400 — Artificial Intelligence Lab</w:t>
-        <w:br/>
-        <w:t>F25-AI-Lab Solutions and Explanation</w:t>
+        <w:t>Artificial Intelligence Lab</w:t>
       </w:r>
     </w:p>
     <w:p>
@@ -22,9 +20,11 @@
       </w:pPr>
       <w:r>
         <w:rPr>
-          <w:i/>
+          <w:b/>
         </w:rPr>
-        <w:t>Student: Rasikh Ali | Roll No.: 42365</w:t>
+        <w:t>Name: Muhammad Usman</w:t>
+        <w:br/>
+        <w:t>Roll No: 025</w:t>
       </w:r>
     </w:p>
     <w:p>
@@ -32,12 +32,12 @@
         <w:pStyle w:val="Heading1"/>
       </w:pPr>
       <w:r>
-        <w:t>Overview</w:t>
+        <w:t>Introduction</w:t>
       </w:r>
     </w:p>
     <w:p>
       <w:r>
-        <w:t>This document explains the Python solutions submitted for the three lab sections. Each solution is kept in its own Lab folder in the GitHub repository. The programs are written using the Python standard library and can be run from a terminal with Python 3.</w:t>
+        <w:t>This file explains the programs I made for the AI Lab tasks. I used basic Python concepts such as if statements, loops, lists, functions, classes and objects.</w:t>
       </w:r>
     </w:p>
     <w:p>
@@ -45,7 +45,7 @@
         <w:pStyle w:val="Heading1"/>
       </w:pPr>
       <w:r>
-        <w:t>Lab 1 — Conditions and Dynamic Calculator</w:t>
+        <w:t>Lab 1</w:t>
       </w:r>
     </w:p>
     <w:p>
@@ -53,12 +53,12 @@
         <w:pStyle w:val="Heading2"/>
       </w:pPr>
       <w:r>
-        <w:t>Task 1: Integer classification</w:t>
+        <w:t>Integer conditions</w:t>
       </w:r>
     </w:p>
     <w:p>
       <w:r>
-        <w:t>The input is converted to an integer with int(). An if/elif/else chain then checks the value. A negative value produces “Negative changed to zero”; 0 produces “Zero”; 1 produces “Single”; and every value greater than 1 produces “More”. A try/except block handles non-integer input so the program does not terminate unexpectedly.</w:t>
+        <w:t>First, the program takes an integer from the user. If the number is negative, it prints Negative changed to zero. It prints Zero for 0, Single for 1, and More for numbers greater than 1.</w:t>
       </w:r>
     </w:p>
     <w:p>
@@ -66,48 +66,12 @@
         <w:pStyle w:val="Heading2"/>
       </w:pPr>
       <w:r>
-        <w:t>Task 2: Chosen mini-project — Dynamic calculator</w:t>
+        <w:t>Dynamic calculator</w:t>
       </w:r>
     </w:p>
     <w:p>
       <w:r>
-        <w:t>I selected the dynamic calculator option. The calculator repeatedly accepts an arithmetic expression, evaluates it, prints the result, and continues until the user enters a blank line. Instead of using eval(), the program parses the expression with Python’s ast module and permits only numeric constants, parentheses, and selected arithmetic operators (+, -, *, /, %, and **). This is safer because arbitrary Python statements cannot be executed.</w:t>
-      </w:r>
-    </w:p>
-    <w:p>
-      <w:pPr>
-        <w:pStyle w:val="ListBullet"/>
-      </w:pPr>
-      <w:r>
-        <w:t>Operator precedence and parentheses are handled by Python’s expression parser.</w:t>
-      </w:r>
-    </w:p>
-    <w:p>
-      <w:pPr>
-        <w:pStyle w:val="ListBullet"/>
-      </w:pPr>
-      <w:r>
-        <w:t>ZeroDivisionError, invalid syntax, and unsupported expressions are caught and displayed as user-friendly errors.</w:t>
-      </w:r>
-    </w:p>
-    <w:p>
-      <w:pPr>
-        <w:pStyle w:val="ListBullet"/>
-      </w:pPr>
-      <w:r>
-        <w:t>Example: 1 + 2 * 3 evaluates to 7, while (4 - 5 / 4) evaluates to 2.75.</w:t>
-      </w:r>
-    </w:p>
-    <w:p>
-      <w:pPr>
-        <w:pStyle w:val="NoSpacing"/>
-      </w:pPr>
-      <w:r>
-        <w:rPr>
-          <w:rFonts w:ascii="Courier New" w:hAnsi="Courier New"/>
-          <w:sz w:val="18"/>
-        </w:rPr>
-        <w:t>python3 Lab-1/lab1_conditions_calculator.py</w:t>
+        <w:t>For the mini project I selected the dynamic calculator. The user enters an arithmetic expression and the program prints the answer. The calculator keeps running until the user presses Enter on an empty line. A try and except statement shows an error message when the expression is not correct.</w:t>
       </w:r>
     </w:p>
     <w:p>
@@ -115,7 +79,7 @@
         <w:pStyle w:val="Heading1"/>
       </w:pPr>
       <w:r>
-        <w:t>Lab 2 — FizzBuzz, Movie Budgets, and OOP</w:t>
+        <w:t>Lab 2</w:t>
       </w:r>
     </w:p>
     <w:p>
@@ -123,12 +87,12 @@
         <w:pStyle w:val="Heading2"/>
       </w:pPr>
       <w:r>
-        <w:t>Task 1: FizzBuzz</w:t>
+        <w:t>FizzBuzz</w:t>
       </w:r>
     </w:p>
     <w:p>
       <w:r>
-        <w:t>The fizzbuzz() function loops from 1 to 100. The divisibility-by-15 test is checked first, so numbers divisible by both 3 and 5 receive “FizzBuzz”. The separate checks then handle “Fizz”, “Buzz”, or the number itself.</w:t>
+        <w:t>A for loop prints numbers from 1 to 100. Numbers divisible by both 3 and 5 print FizzBuzz. Numbers divisible by only 3 print Fizz, and numbers divisible by only 5 print Buzz. Other numbers are printed normally.</w:t>
       </w:r>
     </w:p>
     <w:p>
@@ -136,12 +100,12 @@
         <w:pStyle w:val="Heading2"/>
       </w:pPr>
       <w:r>
-        <w:t>Task 2: Movie budgets</w:t>
+        <w:t>Movie budgets</w:t>
       </w:r>
     </w:p>
     <w:p>
       <w:r>
-        <w:t>The analyze_movie_budgets() function receives a list of (title, budget) tuples. It calculates the average with sum divided by the number of movies, creates a list of movies whose budget is greater than the average, calculates each excess amount, and returns the count. An empty-list check prevents division by zero.</w:t>
+        <w:t>I stored movie names and budgets in a list of tuples. I added all the budgets and divided by the number of movies to get the average. Then I checked each movie and printed the movies whose budgets were above the average.</w:t>
       </w:r>
     </w:p>
     <w:p>
@@ -149,24 +113,12 @@
         <w:pStyle w:val="Heading2"/>
       </w:pPr>
       <w:r>
-        <w:t>Task 3: Object-oriented programming</w:t>
+        <w:t>OOP task</w:t>
       </w:r>
     </w:p>
     <w:p>
       <w:r>
-        <w:t>Vehicle is the base class and defines start_engine(). Car and Motorcycle inherit from Vehicle and override the method with their own messages. Creating Car() and Motorcycle() objects and calling the same method demonstrates polymorphism: the correct subclass implementation runs for each object.</w:t>
-      </w:r>
-    </w:p>
-    <w:p>
-      <w:pPr>
-        <w:pStyle w:val="NoSpacing"/>
-      </w:pPr>
-      <w:r>
-        <w:rPr>
-          <w:rFonts w:ascii="Courier New" w:hAnsi="Courier New"/>
-          <w:sz w:val="18"/>
-        </w:rPr>
-        <w:t>python3 Lab-2/lab2_fizzbuzz_movies_oop.py</w:t>
+        <w:t>Vehicle is the parent class. Car and Motorcycle inherit from Vehicle. Both classes have their own start_engine() method. When the method is called, each object prints its own message. This shows inheritance and method overriding.</w:t>
       </w:r>
     </w:p>
     <w:p>
@@ -174,12 +126,12 @@
         <w:pStyle w:val="Heading1"/>
       </w:pPr>
       <w:r>
-        <w:t>Lab 3 — Model-Based Reflex Agent with AC</w:t>
+        <w:t>Lab 3</w:t>
       </w:r>
     </w:p>
     <w:p>
       <w:r>
-        <w:t>TemperatureAgent stores two internal-state variables: heater_on and ac_on. For each new temperature, the agent compares the percept with rules and changes the relevant state only when necessary. The heater turns on below 20°C and off at 20°C or above. The air-conditioner turns on above 26°C and off at 26°C or below. If neither state changes, the agent reports “No change”.</w:t>
+        <w:t>The TemperatureAgent keeps two values in its memory: heater and ac. If the temperature is below 20 degrees, the heater is turned on. If the temperature is 20 degrees or higher, it is turned off. If the temperature is above 26 degrees, the AC is turned on. Otherwise, the AC is turned off.</w:t>
       </w:r>
     </w:p>
     <w:p>
@@ -187,228 +139,12 @@
         <w:pStyle w:val="Heading2"/>
       </w:pPr>
       <w:r>
-        <w:t>Manual trace for [18, 22, 25, 25, 19]</w:t>
-      </w:r>
-    </w:p>
-    <w:tbl>
-      <w:tblPr>
-        <w:tblStyle w:val="TableGrid"/>
-        <w:tblW w:type="auto" w:w="0"/>
-        <w:tblLook w:firstColumn="1" w:firstRow="1" w:lastColumn="0" w:lastRow="0" w:noHBand="0" w:noVBand="1" w:val="04A0"/>
-      </w:tblPr>
-      <w:tblGrid>
-        <w:gridCol w:w="2880"/>
-        <w:gridCol w:w="2880"/>
-        <w:gridCol w:w="2880"/>
-      </w:tblGrid>
-      <w:tr>
-        <w:tc>
-          <w:tcPr>
-            <w:tcW w:type="dxa" w:w="2880"/>
-          </w:tcPr>
-          <w:p>
-            <w:r>
-              <w:t>Temperature</w:t>
-            </w:r>
-          </w:p>
-        </w:tc>
-        <w:tc>
-          <w:tcPr>
-            <w:tcW w:type="dxa" w:w="2880"/>
-          </w:tcPr>
-          <w:p>
-            <w:r>
-              <w:t>Expected action</w:t>
-            </w:r>
-          </w:p>
-        </w:tc>
-        <w:tc>
-          <w:tcPr>
-            <w:tcW w:type="dxa" w:w="2880"/>
-          </w:tcPr>
-          <w:p>
-            <w:r>
-              <w:t>State after action</w:t>
-            </w:r>
-          </w:p>
-        </w:tc>
-      </w:tr>
-      <w:tr>
-        <w:tc>
-          <w:tcPr>
-            <w:tcW w:type="dxa" w:w="2880"/>
-          </w:tcPr>
-          <w:p>
-            <w:r>
-              <w:t>18°C</w:t>
-            </w:r>
-          </w:p>
-        </w:tc>
-        <w:tc>
-          <w:tcPr>
-            <w:tcW w:type="dxa" w:w="2880"/>
-          </w:tcPr>
-          <w:p>
-            <w:r>
-              <w:t>Heater ON</w:t>
-            </w:r>
-          </w:p>
-        </w:tc>
-        <w:tc>
-          <w:tcPr>
-            <w:tcW w:type="dxa" w:w="2880"/>
-          </w:tcPr>
-          <w:p>
-            <w:r>
-              <w:t>heater=True, ac=False</w:t>
-            </w:r>
-          </w:p>
-        </w:tc>
-      </w:tr>
-      <w:tr>
-        <w:tc>
-          <w:tcPr>
-            <w:tcW w:type="dxa" w:w="2880"/>
-          </w:tcPr>
-          <w:p>
-            <w:r>
-              <w:t>22°C</w:t>
-            </w:r>
-          </w:p>
-        </w:tc>
-        <w:tc>
-          <w:tcPr>
-            <w:tcW w:type="dxa" w:w="2880"/>
-          </w:tcPr>
-          <w:p>
-            <w:r>
-              <w:t>Heater OFF</w:t>
-            </w:r>
-          </w:p>
-        </w:tc>
-        <w:tc>
-          <w:tcPr>
-            <w:tcW w:type="dxa" w:w="2880"/>
-          </w:tcPr>
-          <w:p>
-            <w:r>
-              <w:t>heater=False, ac=False</w:t>
-            </w:r>
-          </w:p>
-        </w:tc>
-      </w:tr>
-      <w:tr>
-        <w:tc>
-          <w:tcPr>
-            <w:tcW w:type="dxa" w:w="2880"/>
-          </w:tcPr>
-          <w:p>
-            <w:r>
-              <w:t>25°C</w:t>
-            </w:r>
-          </w:p>
-        </w:tc>
-        <w:tc>
-          <w:tcPr>
-            <w:tcW w:type="dxa" w:w="2880"/>
-          </w:tcPr>
-          <w:p>
-            <w:r>
-              <w:t>No change</w:t>
-            </w:r>
-          </w:p>
-        </w:tc>
-        <w:tc>
-          <w:tcPr>
-            <w:tcW w:type="dxa" w:w="2880"/>
-          </w:tcPr>
-          <w:p>
-            <w:r>
-              <w:t>heater=False, ac=False</w:t>
-            </w:r>
-          </w:p>
-        </w:tc>
-      </w:tr>
-      <w:tr>
-        <w:tc>
-          <w:tcPr>
-            <w:tcW w:type="dxa" w:w="2880"/>
-          </w:tcPr>
-          <w:p>
-            <w:r>
-              <w:t>25°C</w:t>
-            </w:r>
-          </w:p>
-        </w:tc>
-        <w:tc>
-          <w:tcPr>
-            <w:tcW w:type="dxa" w:w="2880"/>
-          </w:tcPr>
-          <w:p>
-            <w:r>
-              <w:t>No change</w:t>
-            </w:r>
-          </w:p>
-        </w:tc>
-        <w:tc>
-          <w:tcPr>
-            <w:tcW w:type="dxa" w:w="2880"/>
-          </w:tcPr>
-          <w:p>
-            <w:r>
-              <w:t>heater=False, ac=False</w:t>
-            </w:r>
-          </w:p>
-        </w:tc>
-      </w:tr>
-      <w:tr>
-        <w:tc>
-          <w:tcPr>
-            <w:tcW w:type="dxa" w:w="2880"/>
-          </w:tcPr>
-          <w:p>
-            <w:r>
-              <w:t>19°C</w:t>
-            </w:r>
-          </w:p>
-        </w:tc>
-        <w:tc>
-          <w:tcPr>
-            <w:tcW w:type="dxa" w:w="2880"/>
-          </w:tcPr>
-          <w:p>
-            <w:r>
-              <w:t>Heater ON</w:t>
-            </w:r>
-          </w:p>
-        </w:tc>
-        <w:tc>
-          <w:tcPr>
-            <w:tcW w:type="dxa" w:w="2880"/>
-          </w:tcPr>
-          <w:p>
-            <w:r>
-              <w:t>heater=True, ac=False</w:t>
-            </w:r>
-          </w:p>
-        </w:tc>
-      </w:tr>
-    </w:tbl>
-    <w:p>
-      <w:r>
-        <w:t>The hand trace confirms the expected printed actions before execution. No AC action occurs in this sequence because all temperatures are at or below 26°C.</w:t>
+        <w:t>Manual trace</w:t>
       </w:r>
     </w:p>
     <w:p>
-      <w:pPr>
-        <w:pStyle w:val="NoSpacing"/>
-      </w:pPr>
       <w:r>
-        <w:rPr>
-          <w:rFonts w:ascii="Courier New" w:hAnsi="Courier New"/>
-          <w:sz w:val="18"/>
-        </w:rPr>
-        <w:t>python3 Lab-3/lab3_model_based_reflex_ac.py</w:t>
+        <w:t>For the temperatures 18, 22, 25, 25 and 19, the expected heater actions are: Heater ON, Heater OFF, no change, no change and Heater ON. The AC does not turn on because none of these temperatures is above 26 degrees.</w:t>
       </w:r>
     </w:p>
     <w:p>
@@ -416,17 +152,17 @@
         <w:pStyle w:val="Heading1"/>
       </w:pPr>
       <w:r>
-        <w:t>Testing and conclusion</w:t>
+        <w:t>Conclusion</w:t>
       </w:r>
     </w:p>
     <w:p>
       <w:r>
-        <w:t>Each Python file was executed successfully after creation. The interactive calculator was also tested with negative, zero, one, positive, invalid, and arithmetic inputs. The final repository separates the source code by lab and includes this DOCX explanation as the required written submission.</w:t>
+        <w:t>I ran all three Python files and checked the output. The source files are placed in the Lab-1, Lab-2 and Lab-3 folders in the GitHub repository.</w:t>
       </w:r>
     </w:p>
     <w:sectPr>
       <w:pgSz w:w="12240" w:h="15840"/>
-      <w:pgMar w:top="1008" w:right="1800" w:bottom="1008" w:left="1800" w:header="720" w:footer="720" w:gutter="0"/>
+      <w:pgMar w:top="1080" w:right="1800" w:bottom="1080" w:left="1800" w:header="720" w:footer="720" w:gutter="0"/>
       <w:cols w:space="720"/>
       <w:docGrid w:linePitch="360"/>
     </w:sectPr>
@@ -799,7 +535,7 @@
     <w:rsid w:val="00FC693F"/>
     <w:rPr>
       <w:rFonts w:ascii="Arial" w:hAnsi="Arial"/>
-      <w:sz w:val="21"/>
+      <w:sz w:val="22"/>
     </w:rPr>
   </w:style>
   <w:style w:type="paragraph" w:styleId="Header">
@@ -861,7 +597,7 @@
       <w:outlineLvl w:val="0"/>
     </w:pPr>
     <w:rPr>
-      <w:rFonts w:asciiTheme="majorHAnsi" w:eastAsiaTheme="majorEastAsia" w:hAnsiTheme="majorHAnsi" w:cstheme="majorBidi" w:ascii="Arial" w:hAnsi="Arial"/>
+      <w:rFonts w:asciiTheme="majorHAnsi" w:eastAsiaTheme="majorEastAsia" w:hAnsiTheme="majorHAnsi" w:cstheme="majorBidi"/>
       <w:b/>
       <w:bCs/>
       <w:color w:val="365F91" w:themeColor="accent1" w:themeShade="BF"/>
@@ -885,7 +621,7 @@
       <w:outlineLvl w:val="1"/>
     </w:pPr>
     <w:rPr>
-      <w:rFonts w:asciiTheme="majorHAnsi" w:eastAsiaTheme="majorEastAsia" w:hAnsiTheme="majorHAnsi" w:cstheme="majorBidi" w:ascii="Arial" w:hAnsi="Arial"/>
+      <w:rFonts w:asciiTheme="majorHAnsi" w:eastAsiaTheme="majorEastAsia" w:hAnsiTheme="majorHAnsi" w:cstheme="majorBidi"/>
       <w:b/>
       <w:bCs/>
       <w:color w:val="4F81BD" w:themeColor="accent1"/>
@@ -1150,7 +886,7 @@
       <w:contextualSpacing/>
     </w:pPr>
     <w:rPr>
-      <w:rFonts w:asciiTheme="majorHAnsi" w:eastAsiaTheme="majorEastAsia" w:hAnsiTheme="majorHAnsi" w:cstheme="majorBidi" w:ascii="Arial" w:hAnsi="Arial"/>
+      <w:rFonts w:asciiTheme="majorHAnsi" w:eastAsiaTheme="majorEastAsia" w:hAnsiTheme="majorHAnsi" w:cstheme="majorBidi"/>
       <w:color w:val="17365D" w:themeColor="text2" w:themeShade="BF"/>
       <w:spacing w:val="5"/>
       <w:kern w:val="28"/>

</xml_diff>